<commit_message>
Response letter: account for the documentation commit 802464d; paper READMEs
The pushed letter (7b54ea2) predates 802464d and still said the timeout race,
the replay edge case, the seed-overlap erratum, the sim.py docstring and the
calibration citation were not yet in the repository. It now cites 802464d for
each, states that the v2.8.0 tag stays on 1c277a0 (the code that produced the
results, whose hashes the results record), and notes that both races are
documented with their fixes but deliberately left open. Manuscript unchanged.

paper/README.md describes the manuscript, the letter and the PDF figures; the
repository layout in README.md lists them.

Co-Authored-By: Claude Opus 5.5 <noreply@anthropic.com>
Claude-Session: https://claude.ai/code/session_01RjWdFzUgYk6Hwie2YbnvyG
</commit_message>
<xml_diff>
--- a/paper/rebuttal_round4.docx
+++ b/paper/rebuttal_round4.docx
@@ -73,7 +73,7 @@
         <w:t xml:space="preserve">Revised:</w:t>
       </w:r>
       <w:r>
-        <w:t xml:space="preserve"> manuscript revision 4 and release 2.8.0 on the same branch. The repairs are in 441e4f0 (counter staging), 1f0b212 (replay horizon) and 703fbd8 (reversal order). The token bucket and simulator realism are in 6967208. The counter-study protocol is 2a91d78, committed before its driver (c6ebf50) and its runs (8faaa11). The full rerun of the main evaluation (9,919 runs) is a68599a, documentation is in eded092, 0f71757, c41ea58 and 1c277a0, and the manuscript commit accompanies this letter. Section, table and figure numbers refer to revision 4 unless marked otherwise.</w:t>
+        <w:t xml:space="preserve"> manuscript revision 4 and release 2.8.0 on the same branch. The repairs are in 441e4f0 (counter staging), 1f0b212 (replay horizon) and 703fbd8 (reversal order). The token bucket and simulator realism are in 6967208. The counter-study protocol is 2a91d78, committed before its driver (c6ebf50) and its runs (8faaa11). The full rerun of the main evaluation (9,919 runs) is a68599a, documentation is in eded092, 0f71757, c41ea58 and 1c277a0, and the manuscript commit accompanies this letter. A documentation commit made after the runs (802464d) discloses the two open races and the seed overlap in the repository and fixes a docstring and a citation. It changes comments only, so the v2.8.0 tag stays on 1c277a0, the code that produced the results. Section, table and figure numbers refer to revision 4 unless marked otherwise.</w:t>
       </w:r>
     </w:p>
     <w:p>
@@ -183,17 +183,17 @@
         <w:t xml:space="preserve">Seed reuse in the held-out family.</w:t>
       </w:r>
       <w:r>
-        <w:t xml:space="preserve"> Seeds 300 to 309 are new. Of the held-out family's seeds, six (6000 to 6002 and 6100 to 6102) had been used before at other robustness points, for evaluation only, never for selection. Section 6 says so. Two artifact sentences say otherwise and are wrong: the description inside config/counter</w:t>
-      </w:r>
-      <w:r>
-        <w:rPr>
-          <w:i/>
-          <w:iCs/>
-        </w:rPr>
-        <w:t xml:space="preserve">protocol.json ('never used before this protocol'), which cannot be changed without breaking its recorded hash, and the header of results/counter</w:t>
-      </w:r>
-      <w:r>
-        <w:t xml:space="preserve">study.md, which should be corrected in the generating script.</w:t>
+        <w:t xml:space="preserve"> Seeds 300 to 309 are new. Of the held-out family's seeds, six (6000 to 6002 and 6100 to 6102) had been used before at other robustness points, for evaluation only, never for selection. Section 6 says so. Two artifact sentences said otherwise: the description inside config/counter</w:t>
+      </w:r>
+      <w:r>
+        <w:rPr>
+          <w:i/>
+          <w:iCs/>
+        </w:rPr>
+        <w:t xml:space="preserve">protocol.json ('never used before this protocol') and the header of results/counter</w:t>
+      </w:r>
+      <w:r>
+        <w:t xml:space="preserve">study.md. The protocol file is kept as committed so that its recorded hash stands. The erratum is stated in the README, the CHANGELOG, docs/evaluation.md, the report generator and a marked line of results/counter_study.md (802464d).</w:t>
       </w:r>
     </w:p>
     <w:p>
@@ -213,7 +213,7 @@
         <w:t xml:space="preserve">The replay guarantee has a horizon.</w:t>
       </w:r>
       <w:r>
-        <w:t xml:space="preserve"> Effects are applied at most once, and exactly once if a recovery sweep runs within the horizon of 20 minutes (twice the code lifetime). In verification we found one more edge case: a late verification whose own recovery runs more than about 13 minutes (790 s) after it arrived can leave the failure it reverses counted. Batches older than the horizon are skipped and counted in the store key otp:fx:abandoned, but that count is not reported in the results. The simulator never crashes a process, so it is zero there by construction. The edge case is disclosed in the manuscript and this letter, but not yet in the feedback.py module notes or the README.</w:t>
+        <w:t xml:space="preserve"> Effects are applied at most once, and exactly once if a recovery sweep runs within the horizon of 20 minutes (twice the code lifetime). In verification we found one more edge case: a late verification whose own recovery runs more than about 13 minutes (790 s) after it arrived can leave the failure it reverses counted. Batches older than the horizon are skipped and counted in the store key otp:fx:abandoned, but that count is not reported in the results. The simulator never crashes a process, so it is zero there by construction. The repository now states the edge case precisely (feedback.py module notes, README, documentation; 802464d). A failure's block-event identifier lives 21 minutes from the failure, a reversal stays replayable for 20 minutes from the verification, and a verification can arrive up to about 8 minutes after the failure. In the worst case, therefore, a first sweep more than about 13 minutes after the verification finds the identifier gone; there is no gap when the verification follows the failure within 60 s. The fix is small (keep failure identifiers for the horizon plus the code lifetime plus 60 s). We left it open so that the released code stays the code that produced the results.</w:t>
       </w:r>
     </w:p>
     <w:p>
@@ -233,7 +233,7 @@
         <w:t xml:space="preserve">Concurrency residuals.</w:t>
       </w:r>
       <w:r>
-        <w:t xml:space="preserve"> The timeout-worker race reported last round is still open: a correcting receipt that lands between the worker's compare-and-set and its removal of the timeout leaves the send unresolved. Step 11 is still a sequence of separate writes after atomic reservations. A request challenged at Step 11 keeps the source-cap slot it took at Step 9. Section 6 names all four. The repository documentation does not yet list the timeout race; it should.</w:t>
+        <w:t xml:space="preserve"> The timeout-worker race reported last round is still open: a correcting receipt that lands between the worker's compare-and-set and its removal of the timeout leaves the send unresolved. Step 11 is still a sequence of separate writes after atomic reservations. A request challenged at Step 11 keeps the source-cap slot it took at Step 9. Section 6 names all four. The repository now describes both races, with the fix each would take, at the top of feedback.py, in the README and in the CHANGELOG (802464d). For the timeout race the fix is to remove the timeout only if its score is unchanged. Neither fix is applied, for the reason given above; the failure in the timeout race is lost, not doubled.</w:t>
       </w:r>
     </w:p>
     <w:p>
@@ -290,10 +290,10 @@
           <w:b/>
           <w:bCs/>
         </w:rPr>
-        <w:t xml:space="preserve">Small artifact mismatches.</w:t>
-      </w:r>
-      <w:r>
-        <w:t xml:space="preserve"> The simulator's module docstring (sim.py, lines 21 to 24) still says WhatsApp reachability is drawn per request; the code draws it once per number. calibration.py annotates the conversion assumption with '65 %+', while the cited Twilio page says '68 %+ global conversion rate' (re-checked on 3 October 2026). The paper now quotes the source. No number depends on either string.</w:t>
+        <w:t xml:space="preserve">Small artifact mismatches, fixed after the runs.</w:t>
+      </w:r>
+      <w:r>
+        <w:t xml:space="preserve"> The simulator's module docstring said WhatsApp reachability is drawn per request; the code draws it once per number. calibration.py cited a blog post that states no figure and annotated the conversion assumption with '65 %+'. It now cites Twilio's Verify product page, which says '68 %+ global conversion rate' (re-checked on 3 October 2026), and the paper quotes the same page. Both edits are in 802464d. Because they edit source files, the hash of the current tree differs from the code hashes recorded in the results, which identify the code at 1c277a0 (the v2.8.0 tag). The CHANGELOG says so; no behaviour changed and no number depends on either string.</w:t>
       </w:r>
     </w:p>
     <w:p>
@@ -333,7 +333,7 @@
         <w:t xml:space="preserve">Author actions before submission (M19).</w:t>
       </w:r>
       <w:r>
-        <w:t xml:space="preserve"> The affiliation; written permission to describe the incident; confirmation of Table 1's Source column; the highlights file; and pushing the v2.8.0 tag, which exists only in a local clone.</w:t>
+        <w:t xml:space="preserve"> The affiliation; written permission to describe the incident; confirmation of Table 1's Source column; the highlights file; and pushing the v2.8.0 tag (on 1c277a0), which exists only in a local clone.</w:t>
       </w:r>
     </w:p>
     <w:p>
@@ -1895,7 +1895,7 @@
         <w:spacing w:after="120"/>
       </w:pPr>
       <w:r>
-        <w:t xml:space="preserve">Still open: the timeout-worker race, Step 11's separate writes, the source-cap slot of a request challenged at Step 11, and the replay edge case of M6. The paper keeps the simulated algorithm apart from implementation assurance. Section 6 lists the open defects and says that none is exercised by the single-threaded simulator. Twelve real-Redis tests are described as tests of specific cases, not all interleavings, and nowhere is the artifact called deployment-ready.</w:t>
+        <w:t xml:space="preserve">Still open: the timeout-worker race, Step 11's separate writes, the source-cap slot of a request challenged at Step 11, and the replay edge case of M6. The two races are bounded and documented with their fixes in feedback.py, the README and the CHANGELOG (802464d), but not closed, so that the released code stays the code the results were run on. The paper keeps the simulated algorithm apart from implementation assurance. Section 6 lists the open defects and says that none is exercised by the single-threaded simulator. Twelve real-Redis tests are described as tests of specific cases, not all interleavings, and nowhere is the artifact called deployment-ready.</w:t>
       </w:r>
     </w:p>
     <w:p>
@@ -2110,7 +2110,7 @@
         <w:spacing w:after="120"/>
       </w:pPr>
       <w:r>
-        <w:t xml:space="preserve">Every run and checkpoint now carries a code hash, and a checkpoint whose hash differs is rejected. The results record the environment and whether the invocation was clean or resumed. Both studies in this round are clean invocations: the main evaluation (9,919 runs, code hash ec40cf34…) and the counter study (7,925 runs, code hash fbf12e7f…). The counter protocol's SHA-256 (4282e483…) is stored in the results and matches the committed file.</w:t>
+        <w:t xml:space="preserve">Every run and checkpoint now carries a code hash, and a checkpoint whose hash differs is rejected. The results record the environment and whether the invocation was clean or resumed. Both studies in this round are clean invocations: the main evaluation (9,919 runs, code hash ec40cf34…) and the counter study (7,925 runs, code hash fbf12e7f…). The counter protocol's SHA-256 (4282e483…) is stored in the results and matches the committed file. Those code hashes identify the tagged release at 1c277a0. The later documentation commit (802464d) changes comments only, so its tree hashes differently and would be refused as a source for reusing these checkpoints, which is the guard working as intended; the CHANGELOG records this.</w:t>
       </w:r>
     </w:p>
     <w:p>
@@ -2708,7 +2708,7 @@
         <w:spacing w:after="120"/>
       </w:pPr>
       <w:r>
-        <w:t xml:space="preserve">This letter, the manuscript and the README now state the narrowed guarantee: at most once, and exactly once if a sweep runs within the 20-minute horizon. The module notes in feedback.py state it in terms of the horizon H (twice the code lifetime). The edge case in M6 is the one exception; it is disclosed in the manuscript and this letter, and still has to be added to the module notes and the README.</w:t>
+        <w:t xml:space="preserve">This letter, the manuscript, the README and the module notes in feedback.py now state the narrowed guarantee: at most once, and exactly once if a sweep runs within the 20-minute horizon (twice the code lifetime). The edge case in M6 is the one exception, and since 802464d it is stated in the module notes, the README and the documentation as well as in the manuscript.</w:t>
       </w:r>
     </w:p>
     <w:p>

</xml_diff>